<commit_message>
Placement Student Frontend at 12/06
</commit_message>
<xml_diff>
--- a/projects/shell/src/assets/importantDocuments/documents/Stage Arrangements _ Material Requisition Form - Jan 2026.docx
+++ b/projects/shell/src/assets/importantDocuments/documents/Stage Arrangements _ Material Requisition Form - Jan 2026.docx
@@ -3284,8 +3284,6 @@
           <w:szCs w:val="10"/>
         </w:rPr>
       </w:pPr>
-      <w:bookmarkStart w:id="0" w:name="_GoBack"/>
-      <w:bookmarkEnd w:id="0"/>
     </w:p>
     <w:tbl>
       <w:tblPr>
@@ -5790,14 +5788,7 @@
           <w:rFonts w:ascii="Times New Roman" w:hAnsi="Times New Roman" w:cs="Times New Roman"/>
           <w:b/>
         </w:rPr>
-        <w:t xml:space="preserve"> </w:t>
-      </w:r>
-      <w:r>
-        <w:rPr>
-          <w:rFonts w:ascii="Times New Roman" w:hAnsi="Times New Roman" w:cs="Times New Roman"/>
-          <w:b/>
-        </w:rPr>
-        <w:t>Academic</w:t>
+        <w:t xml:space="preserve"> Academic</w:t>
       </w:r>
       <w:r>
         <w:rPr>
@@ -5907,49 +5898,17 @@
           <w:rFonts w:ascii="Times New Roman" w:hAnsi="Times New Roman" w:cs="Times New Roman"/>
           <w:b/>
         </w:rPr>
-        <w:t>ounter No. 4</w:t>
-      </w:r>
-    </w:p>
-    <w:p>
-      <w:pPr>
-        <w:spacing w:after="0"/>
-        <w:rPr>
-          <w:rFonts w:ascii="Times New Roman" w:hAnsi="Times New Roman" w:cs="Times New Roman"/>
-          <w:b/>
-        </w:rPr>
-      </w:pPr>
-    </w:p>
-    <w:p>
-      <w:pPr>
-        <w:spacing w:after="0"/>
-        <w:rPr>
-          <w:rFonts w:ascii="Times New Roman" w:hAnsi="Times New Roman" w:cs="Times New Roman"/>
-          <w:b/>
-        </w:rPr>
-      </w:pPr>
-    </w:p>
-    <w:p>
-      <w:pPr>
-        <w:spacing w:after="0"/>
-        <w:rPr>
-          <w:rFonts w:ascii="Times New Roman" w:hAnsi="Times New Roman" w:cs="Times New Roman"/>
-          <w:b/>
-        </w:rPr>
-      </w:pPr>
-      <w:r>
-        <w:rPr>
-          <w:rFonts w:ascii="Times New Roman" w:hAnsi="Times New Roman" w:cs="Times New Roman"/>
-          <w:b/>
-        </w:rPr>
-        <w:t xml:space="preserve">                             </w:t>
+        <w:t xml:space="preserve">ounter No. </w:t>
       </w:r>
       <w:r>
         <w:rPr>
           <w:rFonts w:ascii="Times New Roman" w:hAnsi="Times New Roman" w:cs="Times New Roman"/>
           <w:b/>
         </w:rPr>
-        <w:tab/>
+        <w:t>5</w:t>
       </w:r>
+      <w:bookmarkStart w:id="0" w:name="_GoBack"/>
+      <w:bookmarkEnd w:id="0"/>
     </w:p>
     <w:sectPr>
       <w:pgSz w:w="11906" w:h="16838"/>

</xml_diff>